<commit_message>
Align grant proof pack with running MVP
</commit_message>
<xml_diff>
--- a/deliverables/Open Perps Reliability Stack - Solana Foundation Proposal.docx
+++ b/deliverables/Open Perps Reliability Stack - Solana Foundation Proposal.docx
@@ -1388,9 +1388,109 @@
         <w:ind w:left="540" w:hanging="279"/>
       </w:pPr>
       <w:r>
+        <w:t>Data reconstruction envelope schema with provider, commitment, slot range, evidence references, known gaps, and scrub-policy validation.</w:t>
+      </w:r>
+    </w:p>
+    <w:p>
+      <w:pPr>
+        <w:pStyle w:val="ListBullet"/>
+        <w:spacing w:after="80"/>
+        <w:ind w:left="540" w:hanging="279"/>
+      </w:pPr>
+      <w:r>
+        <w:t>Expanded Solana runtime failure reason codes for deterministic dry-run explanation.</w:t>
+      </w:r>
+    </w:p>
+    <w:p>
+      <w:pPr>
+        <w:pStyle w:val="ListBullet"/>
+        <w:spacing w:after="80"/>
+        <w:ind w:left="540" w:hanging="279"/>
+      </w:pPr>
+      <w:r>
+        <w:t>Read-only target discovery command for Helius-backed Drift/Jupiter proof setup, currently pending corrected local endpoint access.</w:t>
+      </w:r>
+    </w:p>
+    <w:p>
+      <w:pPr>
+        <w:pStyle w:val="ListBullet"/>
+        <w:spacing w:after="80"/>
+        <w:ind w:left="540" w:hanging="279"/>
+      </w:pPr>
+      <w:r>
+        <w:t>Hosted Railway proof-pack MVP and dashboard with filtered GitHub Pages fallback.</w:t>
+      </w:r>
+    </w:p>
+    <w:p>
+      <w:pPr>
+        <w:pStyle w:val="ListBullet"/>
+        <w:spacing w:after="80"/>
+        <w:ind w:left="540" w:hanging="279"/>
+      </w:pPr>
+      <w:r>
+        <w:t>Hourly hosted smoke monitoring and public artifact boundary checks.</w:t>
+      </w:r>
+    </w:p>
+    <w:p>
+      <w:pPr>
+        <w:pStyle w:val="ListBullet"/>
+        <w:spacing w:after="80"/>
+        <w:ind w:left="540" w:hanging="279"/>
+      </w:pPr>
+      <w:r>
         <w:t>Grant package and application draft.</w:t>
       </w:r>
     </w:p>
+    <w:tbl>
+      <w:tblPr>
+        <w:tblStyle w:val="TableGrid"/>
+        <w:tblW w:type="dxa" w:w="9360"/>
+        <w:tblLayout w:type="fixed"/>
+        <w:tblLook w:firstColumn="1" w:firstRow="1" w:lastColumn="0" w:lastRow="0" w:noHBand="0" w:noVBand="1" w:val="04A0"/>
+      </w:tblPr>
+      <w:tblGrid>
+        <w:gridCol w:w="9360"/>
+      </w:tblGrid>
+      <w:tr>
+        <w:tc>
+          <w:tcPr>
+            <w:tcW w:type="dxa" w:w="9360"/>
+            <w:shd w:fill="EAF3F8"/>
+            <w:tcMar>
+              <w:top w:w="140" w:type="dxa"/>
+              <w:start w:w="180" w:type="dxa"/>
+              <w:bottom w:w="140" w:type="dxa"/>
+              <w:end w:w="180" w:type="dxa"/>
+            </w:tcMar>
+          </w:tcPr>
+          <w:p>
+            <w:pPr>
+              <w:spacing w:after="80"/>
+            </w:pPr>
+            <w:r>
+              <w:rPr>
+                <w:b/>
+                <w:color w:val="1F4D78"/>
+                <w:sz w:val="20"/>
+              </w:rPr>
+              <w:t>Reviewer proof pack</w:t>
+            </w:r>
+          </w:p>
+          <w:p>
+            <w:pPr>
+              <w:spacing w:after="0"/>
+            </w:pPr>
+            <w:r>
+              <w:rPr>
+                <w:sz w:val="20"/>
+              </w:rPr>
+              <w:t>Canonical proof pack: https://refreshing-art-production-86de.up.railway.app/. Dashboard: https://refreshing-art-production-86de.up.railway.app/apps/dashboard/. GitHub Pages remains an equivalent filtered fallback. The MVP proof checklist maps claims to URLs, schemas, fixtures, and validation commands in docs/mvp-proof-checklist.md.</w:t>
+            </w:r>
+          </w:p>
+        </w:tc>
+      </w:tr>
+    </w:tbl>
+    <w:p/>
     <w:p>
       <w:pPr>
         <w:pStyle w:val="Heading1"/>
@@ -1445,6 +1545,16 @@
       </w:pPr>
       <w:r>
         <w:t>Public datasets leak private information. Mitigation: Publish gates and scrub policy remove RPC URLs, API keys, internal paths, route labels, private strategy thresholds, capital controls, and signer/custody metadata.</w:t>
+      </w:r>
+    </w:p>
+    <w:p>
+      <w:pPr>
+        <w:pStyle w:val="ListNumber"/>
+        <w:spacing w:after="80"/>
+        <w:ind w:left="540" w:hanging="279"/>
+      </w:pPr>
+      <w:r>
+        <w:t>Live Helius decode proof is not complete yet. Mitigation: The local read-only command exists, but the first provider run returned Unauthorized. Do not claim historical Drift/Jupiter decode coverage until the endpoint/key is corrected and a scrubbed proof output is generated.</w:t>
       </w:r>
     </w:p>
     <w:p>

</xml_diff>

<commit_message>
Document successful Helius target discovery
</commit_message>
<xml_diff>
--- a/deliverables/Open Perps Reliability Stack - Solana Foundation Proposal.docx
+++ b/deliverables/Open Perps Reliability Stack - Solana Foundation Proposal.docx
@@ -1408,7 +1408,7 @@
         <w:ind w:left="540" w:hanging="279"/>
       </w:pPr>
       <w:r>
-        <w:t>Read-only target discovery command for Helius-backed Drift/Jupiter proof setup, currently pending corrected local endpoint access.</w:t>
+        <w:t>Read-only target discovery command for Helius-backed Drift/Jupiter proof setup; first local run now succeeds and writes scrubbed output under target/.</w:t>
       </w:r>
     </w:p>
     <w:p>
@@ -1554,7 +1554,7 @@
         <w:ind w:left="540" w:hanging="279"/>
       </w:pPr>
       <w:r>
-        <w:t>Live Helius decode proof is not complete yet. Mitigation: The local read-only command exists, but the first provider run returned Unauthorized. Do not claim historical Drift/Jupiter decode coverage until the endpoint/key is corrected and a scrubbed proof output is generated.</w:t>
+        <w:t>Historical Helius decode proof is not complete yet. Mitigation: The local read-only target discovery command succeeds, but deeper Drift market/oracle and Jupiter pool/custody decode coverage still needs public target resolution and scrubbed proof output before it can be claimed.</w:t>
       </w:r>
     </w:p>
     <w:p>

</xml_diff>

<commit_message>
Add ecosystem research loop and refresh grant proposal
</commit_message>
<xml_diff>
--- a/deliverables/Open Perps Reliability Stack - Solana Foundation Proposal.docx
+++ b/deliverables/Open Perps Reliability Stack - Solana Foundation Proposal.docx
@@ -42,6 +42,9 @@
         <w:gridCol w:w="7160"/>
       </w:tblGrid>
       <w:tr>
+        <w:trPr>
+          <w:tblHeader w:val="true"/>
+        </w:trPr>
         <w:tc>
           <w:tcPr>
             <w:tcW w:type="dxa" w:w="2200"/>
@@ -437,7 +440,12 @@
     </w:p>
     <w:p>
       <w:r>
-        <w:t>Open Perps Reliability Stack is open-source developer tooling for Solana onchain perps reliability. It provides read-only protocol adapters, Pyth-aware risk primitives, normalized market-quality data, deterministic dry-run liquidation replay, and public dashboard/API schemas.</w:t>
+        <w:t>Open Perps Reliability Stack is open-source developer tooling for Solana onchain perps reliability. It provides read-only protocol adapters, source-governed decode records, Pyth-aware risk primitives, normalized market-quality data, deterministic dry-run liquidation reasoning, and public dashboard/API schemas.</w:t>
+      </w:r>
+    </w:p>
+    <w:p>
+      <w:r>
+        <w:t>The current MVP is intentionally complementary infrastructure, not a venue. It gives builders and reviewers a reproducible way to inspect reliability evidence across Drift, Jupiter Perps, Phoenix/Rise, oracle inputs, and public proof packages while preserving a strict no-signing and no-production-execution boundary.</w:t>
       </w:r>
     </w:p>
     <w:p>
@@ -460,7 +468,7 @@
         <w:ind w:left="540" w:hanging="279"/>
       </w:pPr>
       <w:r>
-        <w:t>Which oracle feeds are stale, wide, missing, or diverging from venue marks?</w:t>
+        <w:t xml:space="preserve"> Which oracle feeds are stale, wide, missing, or diverging from venue marks?</w:t>
       </w:r>
     </w:p>
     <w:p>
@@ -470,7 +478,7 @@
         <w:ind w:left="540" w:hanging="279"/>
       </w:pPr>
       <w:r>
-        <w:t>Which markets show weak depth, high funding stress, or poor liquidation health?</w:t>
+        <w:t xml:space="preserve"> Which markets show weak depth, high funding stress, or poor liquidation health?</w:t>
       </w:r>
     </w:p>
     <w:p>
@@ -480,7 +488,7 @@
         <w:ind w:left="540" w:hanging="279"/>
       </w:pPr>
       <w:r>
-        <w:t>Which account/event decoders are failing after program or IDL changes?</w:t>
+        <w:t xml:space="preserve"> Which account/event decoders are failing after program or IDL changes?</w:t>
       </w:r>
     </w:p>
     <w:p>
@@ -490,7 +498,7 @@
         <w:ind w:left="540" w:hanging="279"/>
       </w:pPr>
       <w:r>
-        <w:t>Which liquidation windows are detectable from public state, and why would a dry-run accept or reject them?</w:t>
+        <w:t xml:space="preserve"> Which liquidation windows are detectable from public state, and why would a dry-run accept or reject them?</w:t>
       </w:r>
     </w:p>
     <w:p>
@@ -500,7 +508,7 @@
         <w:ind w:left="540" w:hanging="279"/>
       </w:pPr>
       <w:r>
-        <w:t>Which data can be published safely without leaking private strategy, RPC secrets, or signer/custody details?</w:t>
+        <w:t xml:space="preserve"> Which data can be published safely without leaking private strategy, RPC secrets, or signer/custody details?</w:t>
       </w:r>
     </w:p>
     <w:p>
@@ -518,7 +526,7 @@
         <w:ind w:left="540" w:hanging="279"/>
       </w:pPr>
       <w:r>
-        <w:t>Adapter standard for read-only Solana perps venue integrations.</w:t>
+        <w:t xml:space="preserve"> Adapter standard for read-only Solana perps venue integrations.</w:t>
       </w:r>
     </w:p>
     <w:p>
@@ -528,7 +536,7 @@
         <w:ind w:left="540" w:hanging="279"/>
       </w:pPr>
       <w:r>
-        <w:t>First fixture-backed Drift read-only adapter.</w:t>
+        <w:t xml:space="preserve"> First fixture-backed Drift read-only adapter.</w:t>
       </w:r>
     </w:p>
     <w:p>
@@ -538,7 +546,7 @@
         <w:ind w:left="540" w:hanging="279"/>
       </w:pPr>
       <w:r>
-        <w:t>Pyth-aware risk SDK for staleness, confidence, divergence, and liquidation-risk inputs.</w:t>
+        <w:t xml:space="preserve"> Source-review records that gate binary decode and replay claims on canonical source authority.</w:t>
       </w:r>
     </w:p>
     <w:p>
@@ -548,7 +556,7 @@
         <w:ind w:left="540" w:hanging="279"/>
       </w:pPr>
       <w:r>
-        <w:t>Canonical event envelope, lineage model, dataset manifests, and data quality publish gates.</w:t>
+        <w:t xml:space="preserve"> Pyth-aware risk SDK for staleness, confidence, divergence, and liquidation-risk inputs.</w:t>
       </w:r>
     </w:p>
     <w:p>
@@ -558,7 +566,7 @@
         <w:ind w:left="540" w:hanging="279"/>
       </w:pPr>
       <w:r>
-        <w:t>Deterministic replay fixtures and dry-run output bundles with explicit reason codes.</w:t>
+        <w:t xml:space="preserve"> Canonical event envelope, lineage model, dataset manifests, and data quality publish gates.</w:t>
       </w:r>
     </w:p>
     <w:p>
@@ -568,7 +576,17 @@
         <w:ind w:left="540" w:hanging="279"/>
       </w:pPr>
       <w:r>
-        <w:t>Public dashboard/API schemas for market quality, oracle risk, liquidation health, adapter health, and methodology.</w:t>
+        <w:t xml:space="preserve"> Deterministic replay fixtures and dry-run output bundles with explicit reason codes.</w:t>
+      </w:r>
+    </w:p>
+    <w:p>
+      <w:pPr>
+        <w:pStyle w:val="ListBullet"/>
+        <w:spacing w:after="80"/>
+        <w:ind w:left="540" w:hanging="279"/>
+      </w:pPr>
+      <w:r>
+        <w:t xml:space="preserve"> Public dashboard/API schemas for market quality, oracle risk, liquidation health, adapter health, and methodology.</w:t>
       </w:r>
     </w:p>
     <w:p>
@@ -591,7 +609,7 @@
         <w:ind w:left="540" w:hanging="279"/>
       </w:pPr>
       <w:r>
-        <w:t>Pyth confidence, exponent, publish time, and freshness.</w:t>
+        <w:t xml:space="preserve"> Pyth confidence, exponent, publish time, and freshness.</w:t>
       </w:r>
     </w:p>
     <w:p>
@@ -601,7 +619,7 @@
         <w:ind w:left="540" w:hanging="279"/>
       </w:pPr>
       <w:r>
-        <w:t>Slot timing, blockhash expiry, priority fees, compute budget, and account locks.</w:t>
+        <w:t xml:space="preserve"> Slot timing, blockhash expiry, priority fees, compute budget, and account locks.</w:t>
       </w:r>
     </w:p>
     <w:p>
@@ -611,7 +629,7 @@
         <w:ind w:left="540" w:hanging="279"/>
       </w:pPr>
       <w:r>
-        <w:t>Venue-specific program accounts and event layouts.</w:t>
+        <w:t xml:space="preserve"> Venue-specific program accounts and event layouts.</w:t>
       </w:r>
     </w:p>
     <w:p>
@@ -621,7 +639,7 @@
         <w:ind w:left="540" w:hanging="279"/>
       </w:pPr>
       <w:r>
-        <w:t>High-throughput historical state, replay, and public dataset needs.</w:t>
+        <w:t xml:space="preserve"> High-throughput historical state, replay, and public dataset needs.</w:t>
       </w:r>
     </w:p>
     <w:p>
@@ -631,7 +649,90 @@
         <w:ind w:left="540" w:hanging="279"/>
       </w:pPr>
       <w:r>
-        <w:t>Onchain liquidation and margin semantics that differ by Solana venue.</w:t>
+        <w:t xml:space="preserve"> Onchain liquidation and margin semantics that differ by Solana venue.</w:t>
+      </w:r>
+    </w:p>
+    <w:p>
+      <w:pPr>
+        <w:pStyle w:val="ListBullet"/>
+        <w:spacing w:after="80"/>
+        <w:ind w:left="540" w:hanging="279"/>
+      </w:pPr>
+      <w:r>
+        <w:t xml:space="preserve"> Fast-moving network regimes such as VAT, Alpenglow, Agave, Firedancer, and DoubleZero transport changes.</w:t>
+      </w:r>
+    </w:p>
+    <w:p>
+      <w:pPr>
+        <w:pStyle w:val="Heading1"/>
+      </w:pPr>
+      <w:r>
+        <w:t>2026 Ecosystem Refresh And Grant Positioning</w:t>
+      </w:r>
+    </w:p>
+    <w:p>
+      <w:r>
+        <w:t>The latest source-backed research strengthens the grant case while narrowing what should be claimed. Solana Foundation's 2026 Open Perps call explicitly welcomes complementary infrastructure around fully onchain perps; OPRS should therefore position the public-good core as reliability infrastructure rather than as execution, trading, or liquidation operations.</w:t>
+      </w:r>
+    </w:p>
+    <w:p>
+      <w:pPr>
+        <w:pStyle w:val="ListBullet"/>
+        <w:spacing w:after="80"/>
+        <w:ind w:left="540" w:hanging="279"/>
+      </w:pPr>
+      <w:r>
+        <w:t xml:space="preserve"> Drift remains the first fixture-backed adapter path. Historical liquidation reconstruction should advance only from public finalized transaction evidence and pinned legacy source, with migrated Velocity-hosted records used as discovery or corroboration rather than sole authority.</w:t>
+      </w:r>
+    </w:p>
+    <w:p>
+      <w:pPr>
+        <w:pStyle w:val="ListBullet"/>
+        <w:spacing w:after="80"/>
+        <w:ind w:left="540" w:hanging="279"/>
+      </w:pPr>
+      <w:r>
+        <w:t xml:space="preserve"> Jupiter Perps is relevant and should stay in scope, but its canonical position is source-authority blocked: first-party docs support lifecycle semantics, while binary account decoding and deterministic request-to-position pairing require a current Jupiter-confirmed IDL/source or hashable artifact.</w:t>
+      </w:r>
+    </w:p>
+    <w:p>
+      <w:pPr>
+        <w:pStyle w:val="ListBullet"/>
+        <w:spacing w:after="80"/>
+        <w:ind w:left="540" w:hanging="279"/>
+      </w:pPr>
+      <w:r>
+        <w:t xml:space="preserve"> Phoenix/Rise is now a direct second venue target because public gold and crude-oil perps surfaces expose mark, index, volume, open interest, funding, and market state. Canonical program/source and exact oracle/input identities remain gates before account-level decode claims.</w:t>
+      </w:r>
+    </w:p>
+    <w:p>
+      <w:pPr>
+        <w:pStyle w:val="ListBullet"/>
+        <w:spacing w:after="80"/>
+        <w:ind w:left="540" w:hanging="279"/>
+      </w:pPr>
+      <w:r>
+        <w:t xml:space="preserve"> Frontier Traders creates a review-only design-partner channel for professional trader reliability feedback, but it does not establish Blocksize access, demand, or endorsement.</w:t>
+      </w:r>
+    </w:p>
+    <w:p>
+      <w:pPr>
+        <w:pStyle w:val="ListBullet"/>
+        <w:spacing w:after="80"/>
+        <w:ind w:left="540" w:hanging="279"/>
+      </w:pPr>
+      <w:r>
+        <w:t xml:space="preserve"> Pay.sh, Solana Subscriptions, and Commerce Kit are useful for future commercial packaging and revenue-routing clarity. They should stay outside the grant-funded public-good core unless explicitly framed as optional or convertible-grant scope.</w:t>
+      </w:r>
+    </w:p>
+    <w:p>
+      <w:pPr>
+        <w:pStyle w:val="ListBullet"/>
+        <w:spacing w:after="80"/>
+        <w:ind w:left="540" w:hanging="279"/>
+      </w:pPr>
+      <w:r>
+        <w:t xml:space="preserve"> Network changes around VAT, Alpenglow, Agave, Firedancer, and DoubleZero make validator/client/transport context relevant to perps reliability, but releases and schedules do not prove activation, Blocksize adoption, or measured performance gains.</w:t>
       </w:r>
     </w:p>
     <w:p>
@@ -656,6 +757,9 @@
         <w:gridCol w:w="3010"/>
       </w:tblGrid>
       <w:tr>
+        <w:trPr>
+          <w:tblHeader w:val="true"/>
+        </w:trPr>
         <w:tc>
           <w:tcPr>
             <w:tcW w:type="dxa" w:w="1900"/>
@@ -811,7 +915,7 @@
               <w:rPr>
                 <w:sz w:val="18"/>
               </w:rPr>
-              <w:t>Architecture v0, ADRs, adapter standard, capability matrix, Rust workspace, fixture-backed Drift read-only adapter.</w:t>
+              <w:t>Architecture v0, ADRs, adapter standard, capability matrix, Rust workspace, fixture-backed Drift read-only adapter, source-authority records.</w:t>
             </w:r>
           </w:p>
         </w:tc>
@@ -834,7 +938,7 @@
               <w:rPr>
                 <w:sz w:val="18"/>
               </w:rPr>
-              <w:t>Public repo, compile-passing workspace, adapter metadata, execute-disabled safety tests.</w:t>
+              <w:t>Public repo, compile-passing workspace, adapter metadata, execute-disabled safety tests, source-review validators.</w:t>
             </w:r>
           </w:p>
         </w:tc>
@@ -905,7 +1009,7 @@
               <w:rPr>
                 <w:sz w:val="18"/>
               </w:rPr>
-              <w:t>Canonical event envelope, dataset manifest, DQ gates, scrub policy, golden fixtures.</w:t>
+              <w:t>Canonical event envelope, dataset manifest, DQ gates, scrub policy, golden fixtures, Drift liquidation-history probe contract.</w:t>
             </w:r>
           </w:p>
         </w:tc>
@@ -928,7 +1032,7 @@
               <w:rPr>
                 <w:sz w:val="18"/>
               </w:rPr>
-              <w:t>Rust schema types, JSON examples, checksum-bearing fixture manifest.</w:t>
+              <w:t>Rust schema types, JSON examples, checksum-bearing fixture manifest, scrubbed discovery-output schema.</w:t>
             </w:r>
           </w:p>
         </w:tc>
@@ -1093,7 +1197,7 @@
               <w:rPr>
                 <w:sz w:val="18"/>
               </w:rPr>
-              <w:t>Public API schema, dashboard view contract, demo narrative, methodology, limitations.</w:t>
+              <w:t>Public API schema, dashboard view contract, demo narrative, source-governed methodology, limitations, and venue-readiness matrix.</w:t>
             </w:r>
           </w:p>
         </w:tc>
@@ -1116,7 +1220,7 @@
               <w:rPr>
                 <w:sz w:val="18"/>
               </w:rPr>
-              <w:t>Schema files, sample responses, final report, reproducible demo path.</w:t>
+              <w:t>Schema files, sample responses, final report, reproducible demo path, Railway and GitHub Pages proof links.</w:t>
             </w:r>
           </w:p>
         </w:tc>
@@ -1146,7 +1250,7 @@
         <w:ind w:left="540" w:hanging="279"/>
       </w:pPr>
       <w:r>
-        <w:t>GitHub stars, forks, issues, and adapter requests from Solana builders and researchers.</w:t>
+        <w:t xml:space="preserve"> GitHub stars, forks, issues, and adapter requests from Solana builders and researchers.</w:t>
       </w:r>
     </w:p>
     <w:p>
@@ -1156,7 +1260,7 @@
         <w:ind w:left="540" w:hanging="279"/>
       </w:pPr>
       <w:r>
-        <w:t>Adapter standard reuse or comments by perps and infrastructure teams.</w:t>
+        <w:t xml:space="preserve"> Adapter standard reuse or comments by perps and infrastructure teams.</w:t>
       </w:r>
     </w:p>
     <w:p>
@@ -1166,7 +1270,7 @@
         <w:ind w:left="540" w:hanging="279"/>
       </w:pPr>
       <w:r>
-        <w:t>Number of public fixture runs and replay examples.</w:t>
+        <w:t xml:space="preserve"> Number of public fixture runs and replay examples.</w:t>
       </w:r>
     </w:p>
     <w:p>
@@ -1176,7 +1280,7 @@
         <w:ind w:left="540" w:hanging="279"/>
       </w:pPr>
       <w:r>
-        <w:t>Number of supported markets and venues in read-only mode.</w:t>
+        <w:t xml:space="preserve"> Number of supported markets and venues in read-only mode.</w:t>
       </w:r>
     </w:p>
     <w:p>
@@ -1186,7 +1290,7 @@
         <w:ind w:left="540" w:hanging="279"/>
       </w:pPr>
       <w:r>
-        <w:t>Public dataset downloads or downstream notebooks.</w:t>
+        <w:t xml:space="preserve"> Public dataset downloads or downstream notebooks.</w:t>
       </w:r>
     </w:p>
     <w:p>
@@ -1196,7 +1300,17 @@
         <w:ind w:left="540" w:hanging="279"/>
       </w:pPr>
       <w:r>
-        <w:t>Dashboard/API schema consumers.</w:t>
+        <w:t xml:space="preserve"> Dashboard/API schema consumers.</w:t>
+      </w:r>
+    </w:p>
+    <w:p>
+      <w:pPr>
+        <w:pStyle w:val="ListBullet"/>
+        <w:spacing w:after="80"/>
+        <w:ind w:left="540" w:hanging="279"/>
+      </w:pPr>
+      <w:r>
+        <w:t xml:space="preserve"> Source-authority confirmations, issue comments, or protocol maintainer reviews that unblock adapter promotion.</w:t>
       </w:r>
     </w:p>
     <w:p>
@@ -1214,7 +1328,7 @@
         <w:ind w:left="540" w:hanging="279"/>
       </w:pPr>
       <w:r>
-        <w:t>Adapter decode success rate and schema mismatch rate.</w:t>
+        <w:t xml:space="preserve"> Adapter decode success rate and schema mismatch rate.</w:t>
       </w:r>
     </w:p>
     <w:p>
@@ -1224,7 +1338,7 @@
         <w:ind w:left="540" w:hanging="279"/>
       </w:pPr>
       <w:r>
-        <w:t>Oracle stale, wide, missing, or divergent feed counts.</w:t>
+        <w:t xml:space="preserve"> Oracle stale, wide, missing, or divergent feed counts.</w:t>
       </w:r>
     </w:p>
     <w:p>
@@ -1234,7 +1348,7 @@
         <w:ind w:left="540" w:hanging="279"/>
       </w:pPr>
       <w:r>
-        <w:t>Dry-run reason-code distribution.</w:t>
+        <w:t xml:space="preserve"> Dry-run reason-code distribution.</w:t>
       </w:r>
     </w:p>
     <w:p>
@@ -1244,7 +1358,7 @@
         <w:ind w:left="540" w:hanging="279"/>
       </w:pPr>
       <w:r>
-        <w:t>Fixture replay pass/fail status.</w:t>
+        <w:t xml:space="preserve"> Fixture replay pass/fail status.</w:t>
       </w:r>
     </w:p>
     <w:p>
@@ -1254,7 +1368,17 @@
         <w:ind w:left="540" w:hanging="279"/>
       </w:pPr>
       <w:r>
-        <w:t>Dataset publish gate pass/warn/block status.</w:t>
+        <w:t xml:space="preserve"> Dataset publish gate pass/warn/block status.</w:t>
+      </w:r>
+    </w:p>
+    <w:p>
+      <w:pPr>
+        <w:pStyle w:val="ListBullet"/>
+        <w:spacing w:after="80"/>
+        <w:ind w:left="540" w:hanging="279"/>
+      </w:pPr>
+      <w:r>
+        <w:t xml:space="preserve"> Source-review approval status by account type, program ID, commit/hash, and public regression fixture availability.</w:t>
       </w:r>
     </w:p>
     <w:p>
@@ -1298,7 +1422,7 @@
         <w:ind w:left="540" w:hanging="279"/>
       </w:pPr>
       <w:r>
-        <w:t>OSS hygiene files and GitHub workflow.</w:t>
+        <w:t xml:space="preserve"> OSS hygiene files and GitHub workflow.</w:t>
       </w:r>
     </w:p>
     <w:p>
@@ -1308,7 +1432,7 @@
         <w:ind w:left="540" w:hanging="279"/>
       </w:pPr>
       <w:r>
-        <w:t>Architecture docs, roadmap, work packages, and ADRs.</w:t>
+        <w:t xml:space="preserve"> Architecture docs, roadmap, work packages, and ADRs.</w:t>
       </w:r>
     </w:p>
     <w:p>
@@ -1318,7 +1442,7 @@
         <w:ind w:left="540" w:hanging="279"/>
       </w:pPr>
       <w:r>
-        <w:t>Rust workspace with core crates.</w:t>
+        <w:t xml:space="preserve"> Rust workspace with core crates.</w:t>
       </w:r>
     </w:p>
     <w:p>
@@ -1328,7 +1452,7 @@
         <w:ind w:left="540" w:hanging="279"/>
       </w:pPr>
       <w:r>
-        <w:t>Fixture-backed Drift read-only adapter.</w:t>
+        <w:t xml:space="preserve"> Fixture-backed Drift read-only adapter.</w:t>
       </w:r>
     </w:p>
     <w:p>
@@ -1338,7 +1462,7 @@
         <w:ind w:left="540" w:hanging="279"/>
       </w:pPr>
       <w:r>
-        <w:t>Adapter metadata and capability model.</w:t>
+        <w:t xml:space="preserve"> Adapter metadata and capability model.</w:t>
       </w:r>
     </w:p>
     <w:p>
@@ -1348,7 +1472,7 @@
         <w:ind w:left="540" w:hanging="279"/>
       </w:pPr>
       <w:r>
-        <w:t>Canonical event and dataset manifest types.</w:t>
+        <w:t xml:space="preserve"> Canonical event and dataset manifest types.</w:t>
       </w:r>
     </w:p>
     <w:p>
@@ -1358,7 +1482,7 @@
         <w:ind w:left="540" w:hanging="279"/>
       </w:pPr>
       <w:r>
-        <w:t>Data quality publish gate and scrub policy types.</w:t>
+        <w:t xml:space="preserve"> Data quality publish gate and scrub policy types.</w:t>
       </w:r>
     </w:p>
     <w:p>
@@ -1368,7 +1492,7 @@
         <w:ind w:left="540" w:hanging="279"/>
       </w:pPr>
       <w:r>
-        <w:t>Pyth-aware risk primitives with unit tests.</w:t>
+        <w:t xml:space="preserve"> Pyth-aware risk primitives with unit tests.</w:t>
       </w:r>
     </w:p>
     <w:p>
@@ -1378,7 +1502,7 @@
         <w:ind w:left="540" w:hanging="279"/>
       </w:pPr>
       <w:r>
-        <w:t>Replay fixture and dry-run output contracts.</w:t>
+        <w:t xml:space="preserve"> Replay fixture and dry-run output contracts.</w:t>
       </w:r>
     </w:p>
     <w:p>
@@ -1388,7 +1512,7 @@
         <w:ind w:left="540" w:hanging="279"/>
       </w:pPr>
       <w:r>
-        <w:t>Data reconstruction envelope schema with provider, commitment, slot range, evidence references, known gaps, and scrub-policy validation.</w:t>
+        <w:t xml:space="preserve"> Data reconstruction envelope schema with provider, commitment, slot range, evidence references, known gaps, and scrub-policy validation.</w:t>
       </w:r>
     </w:p>
     <w:p>
@@ -1398,7 +1522,7 @@
         <w:ind w:left="540" w:hanging="279"/>
       </w:pPr>
       <w:r>
-        <w:t>Expanded Solana runtime failure reason codes for deterministic dry-run explanation.</w:t>
+        <w:t xml:space="preserve"> Expanded Solana runtime failure reason codes for deterministic dry-run explanation.</w:t>
       </w:r>
     </w:p>
     <w:p>
@@ -1408,7 +1532,7 @@
         <w:ind w:left="540" w:hanging="279"/>
       </w:pPr>
       <w:r>
-        <w:t>Read-only target discovery command for Helius-backed Drift/Jupiter proof setup; first local run now succeeds and writes scrubbed output under target/.</w:t>
+        <w:t xml:space="preserve"> Read-only target discovery command for Helius-backed Drift/Jupiter proof setup; first local run now succeeds and writes scrubbed output under target/.</w:t>
       </w:r>
     </w:p>
     <w:p>
@@ -1418,7 +1542,7 @@
         <w:ind w:left="540" w:hanging="279"/>
       </w:pPr>
       <w:r>
-        <w:t>Hosted Railway proof-pack MVP and dashboard with filtered GitHub Pages fallback.</w:t>
+        <w:t xml:space="preserve"> Jupiter source-authority confirmation packet and send-ready outbound note.</w:t>
       </w:r>
     </w:p>
     <w:p>
@@ -1428,7 +1552,7 @@
         <w:ind w:left="540" w:hanging="279"/>
       </w:pPr>
       <w:r>
-        <w:t>Hourly hosted smoke monitoring and public artifact boundary checks.</w:t>
+        <w:t xml:space="preserve"> Source-review record schema and examples for Jupiter authority confirmation and Drift public-field promotion.</w:t>
       </w:r>
     </w:p>
     <w:p>
@@ -1438,7 +1562,47 @@
         <w:ind w:left="540" w:hanging="279"/>
       </w:pPr>
       <w:r>
-        <w:t>Grant package and application draft.</w:t>
+        <w:t xml:space="preserve"> Scrubbed Drift liquidation-history probe schema, validator, and bounded discovery output contract.</w:t>
+      </w:r>
+    </w:p>
+    <w:p>
+      <w:pPr>
+        <w:pStyle w:val="ListBullet"/>
+        <w:spacing w:after="80"/>
+        <w:ind w:left="540" w:hanging="279"/>
+      </w:pPr>
+      <w:r>
+        <w:t xml:space="preserve"> Continuous Solana ecosystem research loop with hot state, evidence ledger, opportunity pipeline, and checkpoint archive.</w:t>
+      </w:r>
+    </w:p>
+    <w:p>
+      <w:pPr>
+        <w:pStyle w:val="ListBullet"/>
+        <w:spacing w:after="80"/>
+        <w:ind w:left="540" w:hanging="279"/>
+      </w:pPr>
+      <w:r>
+        <w:t xml:space="preserve"> Hosted Railway proof-pack MVP and dashboard with filtered GitHub Pages fallback.</w:t>
+      </w:r>
+    </w:p>
+    <w:p>
+      <w:pPr>
+        <w:pStyle w:val="ListBullet"/>
+        <w:spacing w:after="80"/>
+        <w:ind w:left="540" w:hanging="279"/>
+      </w:pPr>
+      <w:r>
+        <w:t xml:space="preserve"> Hourly hosted smoke monitoring and public artifact boundary checks.</w:t>
+      </w:r>
+    </w:p>
+    <w:p>
+      <w:pPr>
+        <w:pStyle w:val="ListBullet"/>
+        <w:spacing w:after="80"/>
+        <w:ind w:left="540" w:hanging="279"/>
+      </w:pPr>
+      <w:r>
+        <w:t xml:space="preserve"> Grant package and application draft.</w:t>
       </w:r>
     </w:p>
     <w:tbl>
@@ -1544,6 +1708,36 @@
         <w:ind w:left="540" w:hanging="279"/>
       </w:pPr>
       <w:r>
+        <w:t>Jupiter source authority is not yet canonical. Mitigation: Use first-party Jupiter docs only for semantic labels. Keep binary decode, deterministic request/fulfillment pairing, and historical replay blocked until Jupiter provides or confirms a current hashable IDL/source and fixtures.</w:t>
+      </w:r>
+    </w:p>
+    <w:p>
+      <w:pPr>
+        <w:pStyle w:val="ListNumber"/>
+        <w:spacing w:after="80"/>
+        <w:ind w:left="540" w:hanging="279"/>
+      </w:pPr>
+      <w:r>
+        <w:t>Phoenix public telemetry is not yet program-level proof. Mitigation: Use public GOLD and external-asset surfaces for adapter-contract design while keeping canonical program, exact oracle inputs, account layouts, and transaction fixtures as explicit gates.</w:t>
+      </w:r>
+    </w:p>
+    <w:p>
+      <w:pPr>
+        <w:pStyle w:val="ListNumber"/>
+        <w:spacing w:after="80"/>
+        <w:ind w:left="540" w:hanging="279"/>
+      </w:pPr>
+      <w:r>
+        <w:t>Research findings could drift into overclaiming. Mitigation: Maintain the Solana ecosystem loop as source-backed project memory, separate fact from inference, and require proof artifacts before promoting any partner, demand, revenue, or protocol-safety claim.</w:t>
+      </w:r>
+    </w:p>
+    <w:p>
+      <w:pPr>
+        <w:pStyle w:val="ListNumber"/>
+        <w:spacing w:after="80"/>
+        <w:ind w:left="540" w:hanging="279"/>
+      </w:pPr>
+      <w:r>
         <w:t>Public datasets leak private information. Mitigation: Publish gates and scrub policy remove RPC URLs, API keys, internal paths, route labels, private strategy thresholds, capital controls, and signer/custody metadata.</w:t>
       </w:r>
     </w:p>
@@ -1592,7 +1786,7 @@
         <w:ind w:left="540" w:hanging="279"/>
       </w:pPr>
       <w:r>
-        <w:t>Recommended funding category: Developer Tooling.</w:t>
+        <w:t xml:space="preserve"> Recommended funding category: Developer Tooling.</w:t>
       </w:r>
     </w:p>
     <w:p>
@@ -1602,7 +1796,7 @@
         <w:ind w:left="540" w:hanging="279"/>
       </w:pPr>
       <w:r>
-        <w:t>Recommended form amount: $125,000.</w:t>
+        <w:t xml:space="preserve"> Recommended form amount: $125,000.</w:t>
       </w:r>
     </w:p>
     <w:p>
@@ -1612,7 +1806,7 @@
         <w:ind w:left="540" w:hanging="279"/>
       </w:pPr>
       <w:r>
-        <w:t>Recommended on-chain accounts field: N/A - read-only and dry-run only.</w:t>
+        <w:t xml:space="preserve"> Recommended on-chain accounts field: N/A - read-only and dry-run only.</w:t>
       </w:r>
     </w:p>
     <w:p>
@@ -1622,7 +1816,7 @@
         <w:ind w:left="540" w:hanging="279"/>
       </w:pPr>
       <w:r>
-        <w:t>Recommended project/idea field: short summary plus this proposal document and public GitHub repo.</w:t>
+        <w:t xml:space="preserve"> Recommended project/idea field: short summary plus this proposal document and public GitHub repo.</w:t>
       </w:r>
     </w:p>
     <w:sectPr>

</xml_diff>

<commit_message>
Refresh grant proposal with latest source boundaries
</commit_message>
<xml_diff>
--- a/deliverables/Open Perps Reliability Stack - Solana Foundation Proposal.docx
+++ b/deliverables/Open Perps Reliability Stack - Solana Foundation Proposal.docx
@@ -44,6 +44,7 @@
       <w:tr>
         <w:trPr>
           <w:tblHeader w:val="true"/>
+          <w:cantSplit/>
         </w:trPr>
         <w:tc>
           <w:tcPr>
@@ -91,6 +92,9 @@
         </w:tc>
       </w:tr>
       <w:tr>
+        <w:trPr>
+          <w:cantSplit/>
+        </w:trPr>
         <w:tc>
           <w:tcPr>
             <w:tcW w:type="dxa" w:w="2200"/>
@@ -139,6 +143,9 @@
         </w:tc>
       </w:tr>
       <w:tr>
+        <w:trPr>
+          <w:cantSplit/>
+        </w:trPr>
         <w:tc>
           <w:tcPr>
             <w:tcW w:type="dxa" w:w="2200"/>
@@ -187,6 +194,9 @@
         </w:tc>
       </w:tr>
       <w:tr>
+        <w:trPr>
+          <w:cantSplit/>
+        </w:trPr>
         <w:tc>
           <w:tcPr>
             <w:tcW w:type="dxa" w:w="2200"/>
@@ -235,6 +245,9 @@
         </w:tc>
       </w:tr>
       <w:tr>
+        <w:trPr>
+          <w:cantSplit/>
+        </w:trPr>
         <w:tc>
           <w:tcPr>
             <w:tcW w:type="dxa" w:w="2200"/>
@@ -283,6 +296,9 @@
         </w:tc>
       </w:tr>
       <w:tr>
+        <w:trPr>
+          <w:cantSplit/>
+        </w:trPr>
         <w:tc>
           <w:tcPr>
             <w:tcW w:type="dxa" w:w="2200"/>
@@ -331,6 +347,9 @@
         </w:tc>
       </w:tr>
       <w:tr>
+        <w:trPr>
+          <w:cantSplit/>
+        </w:trPr>
         <w:tc>
           <w:tcPr>
             <w:tcW w:type="dxa" w:w="2200"/>
@@ -440,7 +459,7 @@
     </w:p>
     <w:p>
       <w:r>
-        <w:t>Open Perps Reliability Stack is open-source developer tooling for Solana onchain perps reliability. It provides read-only protocol adapters, source-governed decode records, Pyth-aware risk primitives, normalized market-quality data, deterministic dry-run liquidation reasoning, and public dashboard/API schemas.</w:t>
+        <w:t>Open Perps Reliability Stack is open-source developer tooling for Solana onchain perps reliability. It provides read-only protocol adapters, source-governed decode records, Pyth-aware risk primitives, normalized market-quality data, fixture-backed deterministic dry-run reasoning, and public dashboard/API schemas.</w:t>
       </w:r>
     </w:p>
     <w:p>
@@ -458,7 +477,7 @@
     </w:p>
     <w:p>
       <w:r>
-        <w:t>Solana perps venues are becoming more important, but reliability tooling is fragmented. Builders and risk teams need to understand market quality, oracle health, liquidation conditions, adapter/decode quality, and execution reliability under stress. Today these views are often venue-specific, private, or embedded inside searcher infrastructure.</w:t>
+        <w:t>Solana perps venues are becoming more important, but reliability tooling is fragmented. Builders and risk teams need to understand market quality, oracle health, liquidation conditions, adapter/decode quality, and dry-run execution-failure methodology under stress. Today these views are often venue-specific, private, or embedded inside searcher infrastructure.</w:t>
       </w:r>
     </w:p>
     <w:p>
@@ -702,7 +721,7 @@
         <w:ind w:left="540" w:hanging="279"/>
       </w:pPr>
       <w:r>
-        <w:t xml:space="preserve"> Phoenix/Rise is now a direct second venue target because public gold and crude-oil perps surfaces expose mark, index, volume, open interest, funding, and market state. Canonical program/source and exact oracle/input identities remain gates before account-level decode claims.</w:t>
+        <w:t xml:space="preserve"> Phoenix/Rise is now a source-pinned follow-on venue lane because public gold and crude-oil perps surfaces expose mark, index, volume, open interest, funding, and market state. Production program and Hawkeye view constants are source-pinned from Ellipsis Labs Rise, while exact oracle/input identities, account-level decode, trader monitoring, and replay remain gates.</w:t>
       </w:r>
     </w:p>
     <w:p>
@@ -736,6 +755,11 @@
       </w:r>
     </w:p>
     <w:p>
+      <w:r>
+        <w:br w:type="page"/>
+      </w:r>
+    </w:p>
+    <w:p>
       <w:pPr>
         <w:pStyle w:val="Heading1"/>
       </w:pPr>
@@ -759,6 +783,7 @@
       <w:tr>
         <w:trPr>
           <w:tblHeader w:val="true"/>
+          <w:cantSplit/>
         </w:trPr>
         <w:tc>
           <w:tcPr>
@@ -850,6 +875,9 @@
         </w:tc>
       </w:tr>
       <w:tr>
+        <w:trPr>
+          <w:cantSplit/>
+        </w:trPr>
         <w:tc>
           <w:tcPr>
             <w:tcW w:type="dxa" w:w="1900"/>
@@ -944,6 +972,9 @@
         </w:tc>
       </w:tr>
       <w:tr>
+        <w:trPr>
+          <w:cantSplit/>
+        </w:trPr>
         <w:tc>
           <w:tcPr>
             <w:tcW w:type="dxa" w:w="1900"/>
@@ -1038,6 +1069,9 @@
         </w:tc>
       </w:tr>
       <w:tr>
+        <w:trPr>
+          <w:cantSplit/>
+        </w:trPr>
         <w:tc>
           <w:tcPr>
             <w:tcW w:type="dxa" w:w="1900"/>
@@ -1132,6 +1166,9 @@
         </w:tc>
       </w:tr>
       <w:tr>
+        <w:trPr>
+          <w:cantSplit/>
+        </w:trPr>
         <w:tc>
           <w:tcPr>
             <w:tcW w:type="dxa" w:w="1900"/>
@@ -1572,6 +1609,16 @@
         <w:ind w:left="540" w:hanging="279"/>
       </w:pPr>
       <w:r>
+        <w:t xml:space="preserve"> Drift legacy liquidation-history diligence has scanned 35,000 finalized program transactions from July 22 back through slot 419548703 on May 13 without a matching Liquidate* log; this is queue progress only, not evidence that liquidations were absent.</w:t>
+      </w:r>
+    </w:p>
+    <w:p>
+      <w:pPr>
+        <w:pStyle w:val="ListBullet"/>
+        <w:spacing w:after="80"/>
+        <w:ind w:left="540" w:hanging="279"/>
+      </w:pPr>
+      <w:r>
         <w:t xml:space="preserve"> Continuous Solana ecosystem research loop with hot state, evidence ledger, opportunity pipeline, and checkpoint archive.</w:t>
       </w:r>
     </w:p>
@@ -1718,7 +1765,7 @@
         <w:ind w:left="540" w:hanging="279"/>
       </w:pPr>
       <w:r>
-        <w:t>Phoenix public telemetry is not yet program-level proof. Mitigation: Use public GOLD and external-asset surfaces for adapter-contract design while keeping canonical program, exact oracle inputs, account layouts, and transaction fixtures as explicit gates.</w:t>
+        <w:t>Phoenix public telemetry is not yet account-level replay proof. Mitigation: Use public GOLD and external-asset surfaces plus source-pinned program/Hawkeye constants for adapter-contract design while keeping exact oracle inputs, account layouts, and transaction fixtures as explicit gates.</w:t>
       </w:r>
     </w:p>
     <w:p>

</xml_diff>

<commit_message>
Refresh Solana research and Drift scan boundary
</commit_message>
<xml_diff>
--- a/deliverables/Open Perps Reliability Stack - Solana Foundation Proposal.docx
+++ b/deliverables/Open Perps Reliability Stack - Solana Foundation Proposal.docx
@@ -751,7 +751,17 @@
         <w:ind w:left="540" w:hanging="279"/>
       </w:pPr>
       <w:r>
-        <w:t xml:space="preserve"> Network changes around VAT, Alpenglow, Agave, Firedancer, and DoubleZero make validator/client/transport context relevant to perps reliability, but releases and schedules do not prove activation, Blocksize adoption, or measured performance gains.</w:t>
+        <w:t xml:space="preserve"> The 100M-CU block-capacity activation adds a new benchmark regime for aggregate block headroom, unchanged hot-account contention, replay, catchup, and downstream infrastructure behavior. It is context for reliability methodology, not evidence of measured performance improvement.</w:t>
+      </w:r>
+    </w:p>
+    <w:p>
+      <w:pPr>
+        <w:pStyle w:val="ListBullet"/>
+        <w:spacing w:after="80"/>
+        <w:ind w:left="540" w:hanging="279"/>
+      </w:pPr>
+      <w:r>
+        <w:t xml:space="preserve"> Network changes around VAT, Alpenglow, Agave, Firedancer, and DoubleZero make validator/client/transport context relevant to perps reliability, but releases, schedules, and gossip records do not prove Blocksize adoption or measured performance gains.</w:t>
       </w:r>
     </w:p>
     <w:p>
@@ -1609,7 +1619,7 @@
         <w:ind w:left="540" w:hanging="279"/>
       </w:pPr>
       <w:r>
-        <w:t xml:space="preserve"> Drift legacy liquidation-history diligence has scanned 148,000 finalized program transactions from July 22 back through slot 418069879 at 2026-05-07T00:06:06Z without a matching Liquidate* log; this is queue progress only, not evidence that liquidations were absent.</w:t>
+        <w:t xml:space="preserve"> Drift legacy liquidation-history diligence has scanned 266,000 finalized program transactions from July 22 back through slot 415904436 at 2026-04-27T01:47:05Z without a matching Liquidate* log; this is queue progress only, not evidence that liquidations were absent.</w:t>
       </w:r>
     </w:p>
     <w:p>

</xml_diff>

<commit_message>
Refresh Drift scan to 278k
</commit_message>
<xml_diff>
--- a/deliverables/Open Perps Reliability Stack - Solana Foundation Proposal.docx
+++ b/deliverables/Open Perps Reliability Stack - Solana Foundation Proposal.docx
@@ -751,7 +751,7 @@
         <w:ind w:left="540" w:hanging="279"/>
       </w:pPr>
       <w:r>
-        <w:t xml:space="preserve"> The 100M-CU block-capacity activation adds a new benchmark regime for aggregate block headroom, unchanged hot-account contention, replay, catchup, and downstream infrastructure behavior. It is context for reliability methodology, not evidence of measured performance improvement.</w:t>
+        <w:t xml:space="preserve"> The 100M-CU block-capacity activation and the source-governed 400ms-to-350ms slot-time activation at slot 440208000 add new benchmark regimes for aggregate block headroom, slot-normalized landing, unchanged hot-account contention, replay, catchup, and downstream infrastructure behavior. They are context for reliability methodology, not evidence of measured performance improvement.</w:t>
       </w:r>
     </w:p>
     <w:p>
@@ -1619,7 +1619,7 @@
         <w:ind w:left="540" w:hanging="279"/>
       </w:pPr>
       <w:r>
-        <w:t xml:space="preserve"> Drift legacy liquidation-history diligence has scanned 266,000 finalized program transactions from July 22 back through slot 415904436 at 2026-04-27T01:47:05Z without a matching Liquidate* log; this is queue progress only, not evidence that liquidations were absent.</w:t>
+        <w:t xml:space="preserve"> Drift legacy liquidation-history diligence has scanned 278,000 finalized program transactions from July 22 back through slot 415733773 at 2026-04-26T07:00:53Z without a matching Liquidate* log; this is queue progress only, not evidence that liquidations were absent.</w:t>
       </w:r>
     </w:p>
     <w:p>

</xml_diff>

<commit_message>
Add Railway IaC and slot benchmark proof
</commit_message>
<xml_diff>
--- a/deliverables/Open Perps Reliability Stack - Solana Foundation Proposal.docx
+++ b/deliverables/Open Perps Reliability Stack - Solana Foundation Proposal.docx
@@ -1619,7 +1619,17 @@
         <w:ind w:left="540" w:hanging="279"/>
       </w:pPr>
       <w:r>
-        <w:t xml:space="preserve"> Drift legacy liquidation-history diligence has scanned 278,000 finalized program transactions from July 22 back through slot 415733773 at 2026-04-26T07:00:53Z without a matching Liquidate* log; this is queue progress only, not evidence that liquidations were absent.</w:t>
+        <w:t xml:space="preserve"> Drift legacy liquidation-history diligence has scanned 288,000 finalized program transactions from July 22 back through slot 415592674 at 2026-04-25T15:31:16Z without a matching Liquidate* log; this is queue progress only, not evidence that liquidations were absent.</w:t>
+      </w:r>
+    </w:p>
+    <w:p>
+      <w:pPr>
+        <w:pStyle w:val="ListBullet"/>
+        <w:spacing w:after="80"/>
+        <w:ind w:left="540" w:hanging="279"/>
+      </w:pPr>
+      <w:r>
+        <w:t xml:space="preserve"> Slot-regime benchmark package for the source-governed 400ms-to-350ms activation boundary at slot 440208000, with pre/post windows for future read-only normalization and explicit no-performance-claim gates.</w:t>
       </w:r>
     </w:p>
     <w:p>

</xml_diff>

<commit_message>
Add Jupiter role map probe and Drift 318k checkpoint
</commit_message>
<xml_diff>
--- a/deliverables/Open Perps Reliability Stack - Solana Foundation Proposal.docx
+++ b/deliverables/Open Perps Reliability Stack - Solana Foundation Proposal.docx
@@ -711,7 +711,7 @@
         <w:ind w:left="540" w:hanging="279"/>
       </w:pPr>
       <w:r>
-        <w:t xml:space="preserve"> Jupiter Perps is relevant and should stay in scope, but its canonical position is source-authority blocked: first-party docs support lifecycle semantics, while binary account decoding and deterministic request-to-position pairing require a current Jupiter-confirmed IDL/source or hashable artifact.</w:t>
+        <w:t xml:space="preserve"> Jupiter Perps is relevant and should stay in scope. Account-layout decode is now source-authorized through the live onchain Anchor IDL, and local role-map probing can bind sampled public transactions to IDL instruction roles; deterministic request-to-position pairing, keeper semantics, and replay still require before/after lifecycle evidence and source-review gates.</w:t>
       </w:r>
     </w:p>
     <w:p>
@@ -1619,7 +1619,17 @@
         <w:ind w:left="540" w:hanging="279"/>
       </w:pPr>
       <w:r>
-        <w:t xml:space="preserve"> Drift legacy liquidation-history diligence has scanned 308,000 finalized program transactions from July 22 back through slot 415272972 at 2026-04-24T04:25:58Z without a matching Liquidate* log; this is queue progress only, not evidence that liquidations were absent.</w:t>
+        <w:t xml:space="preserve"> Drift legacy liquidation-history diligence has scanned 318,000 finalized program transactions from July 22 back through slot 415091952 at 2026-04-23T08:31:20Z without a matching Liquidate* log; this is queue progress only, not evidence that liquidations were absent.</w:t>
+      </w:r>
+    </w:p>
+    <w:p>
+      <w:pPr>
+        <w:pStyle w:val="ListBullet"/>
+        <w:spacing w:after="80"/>
+        <w:ind w:left="540" w:hanging="279"/>
+      </w:pPr>
+      <w:r>
+        <w:t xml:space="preserve"> Jupiter lifecycle role-map probe contract that binds sampled public transactions to hash-pinned onchain-IDL instruction roles while keeping signatures, account keys, raw instructions, raw transactions, verified pairing, keeper semantics, replay, and execution claims out of public artifacts.</w:t>
       </w:r>
     </w:p>
     <w:p>
@@ -1775,7 +1785,7 @@
         <w:ind w:left="540" w:hanging="279"/>
       </w:pPr>
       <w:r>
-        <w:t>Jupiter source authority is not yet canonical. Mitigation: Use first-party Jupiter docs only for semantic labels. Keep binary decode, deterministic request/fulfillment pairing, and historical replay blocked until Jupiter provides or confirms a current hashable IDL/source and fixtures.</w:t>
+        <w:t>Jupiter lifecycle proof is not yet canonical. Mitigation: Use the live onchain Anchor IDL for account-layout decode and structural role-map probing only. Keep deterministic request/fulfillment pairing, keeper semantics, and historical replay blocked until before/after lifecycle evidence and source-review gates land.</w:t>
       </w:r>
     </w:p>
     <w:p>
@@ -1815,7 +1825,7 @@
         <w:ind w:left="540" w:hanging="279"/>
       </w:pPr>
       <w:r>
-        <w:t>Historical Helius decode proof is not complete yet. Mitigation: The local read-only target discovery command succeeds, but deeper Drift market/oracle and Jupiter pool/custody decode coverage still needs public target resolution and scrubbed proof output before it can be claimed.</w:t>
+        <w:t>Historical Helius decode proof is not complete yet. Mitigation: The local read-only target discovery and Jupiter layout/role-map commands succeed, but deeper Drift market economics, before/after Jupiter lifecycle state, and Phoenix account-level decode still need scrubbed proof output before they can be claimed.</w:t>
       </w:r>
     </w:p>
     <w:p>

</xml_diff>

<commit_message>
Refresh Solana grant proposal proof points
</commit_message>
<xml_diff>
--- a/deliverables/Open Perps Reliability Stack - Solana Foundation Proposal.docx
+++ b/deliverables/Open Perps Reliability Stack - Solana Foundation Proposal.docx
@@ -1649,6 +1649,46 @@
         <w:ind w:left="540" w:hanging="279"/>
       </w:pPr>
       <w:r>
+        <w:t xml:space="preserve"> Local read-only worker wrapper with bounded Drift, Jupiter, Phoenix, and Slack-sample jobs. The wrapper defaults to plan mode and keeps execution, signing, key loading, custody, and capital-management flags false.</w:t>
+      </w:r>
+    </w:p>
+    <w:p>
+      <w:pPr>
+        <w:pStyle w:val="ListBullet"/>
+        <w:spacing w:after="80"/>
+        <w:ind w:left="540" w:hanging="279"/>
+      </w:pPr>
+      <w:r>
+        <w:t xml:space="preserve"> Private read-only worker run envelope that records artifact hashes, byte lengths, protocol labels, validator status, and promotion policy without copying worker payload bodies into public artifacts.</w:t>
+      </w:r>
+    </w:p>
+    <w:p>
+      <w:pPr>
+        <w:pStyle w:val="ListBullet"/>
+        <w:spacing w:after="80"/>
+        <w:ind w:left="540" w:hanging="279"/>
+      </w:pPr>
+      <w:r>
+        <w:t xml:space="preserve"> Public-safe worker candidate summary that can summarize a private envelope by dataset names, hashes, validator status, protocol labels, and blocked promotion gates while excluding private paths and payload bodies.</w:t>
+      </w:r>
+    </w:p>
+    <w:p>
+      <w:pPr>
+        <w:pStyle w:val="ListBullet"/>
+        <w:spacing w:after="80"/>
+        <w:ind w:left="540" w:hanging="279"/>
+      </w:pPr>
+      <w:r>
+        <w:t xml:space="preserve"> Public package manifest and DQ promotion template for future worker candidates. The template is hosted for reviewer clarity but remains blocked until founder review, final scrub, checksum binding, zero blocking DQ failures, and contract-index review.</w:t>
+      </w:r>
+    </w:p>
+    <w:p>
+      <w:pPr>
+        <w:pStyle w:val="ListBullet"/>
+        <w:spacing w:after="80"/>
+        <w:ind w:left="540" w:hanging="279"/>
+      </w:pPr>
+      <w:r>
         <w:t xml:space="preserve"> Continuous Solana ecosystem research loop with hot state, evidence ledger, opportunity pipeline, and checkpoint archive.</w:t>
       </w:r>
     </w:p>
@@ -1725,7 +1765,7 @@
               <w:rPr>
                 <w:sz w:val="20"/>
               </w:rPr>
-              <w:t>Canonical proof pack: https://refreshing-art-production-86de.up.railway.app/. Dashboard: https://refreshing-art-production-86de.up.railway.app/apps/dashboard/. GitHub Pages remains an equivalent filtered fallback. The MVP proof checklist maps claims to URLs, schemas, fixtures, and validation commands in docs/mvp-proof-checklist.md.</w:t>
+              <w:t>Canonical proof pack: https://refreshing-art-production-86de.up.railway.app/. Dashboard: https://refreshing-art-production-86de.up.railway.app/apps/dashboard/. GitHub Pages remains an equivalent filtered fallback. The MVP proof checklist maps claims to URLs, schemas, fixtures, worker candidate gates, and validation commands in docs/mvp-proof-checklist.md.</w:t>
             </w:r>
           </w:p>
         </w:tc>

</xml_diff>